<commit_message>
Rebuild the PI summary as a script, with collaborative positioning
The document is now generated by docs/manuscripts/build_summary.py rather
than typed inline, because the findings table changes with every battery run
and has to be regenerated rather than hand-edited.

Adds a section placing the work alongside Rames et al. as complementary --
supervised regressors versus prompted general-purpose models -- suitable for
sending to those authors. The findings table now carries both models and
shows that they fail in opposite ways: Qwen imprecise and driven by surface
form, Claude perfectly repeatable but using only 3 of 7 scale points with
75% of ratings at the midpoint.

Co-Authored-By: Claude Opus 5 (1M context) <noreply@anthropic.com>
Claude-Session: https://claude.ai/code/session_017oSxrxZeEoMm8dcXS9cY3E
</commit_message>
<xml_diff>
--- a/docs/manuscripts/Cautionary_Paper_Methods_Summary.docx
+++ b/docs/manuscripts/Cautionary_Paper_Methods_Summary.docx
@@ -10,9 +10,9 @@
         <w:rPr>
           <w:b/>
           <w:color w:val="1F364D"/>
-          <w:sz w:val="34"/>
+          <w:sz w:val="32"/>
         </w:rPr>
-        <w:t>Are Multimodal Model Aesthetic Ratings a Measurement?</w:t>
+        <w:t>Are Prompted Multimodal Model Aesthetic Ratings a Measurement?</w:t>
       </w:r>
     </w:p>
     <w:p>
@@ -36,7 +36,7 @@
           <w:color w:val="606060"/>
           <w:sz w:val="19"/>
         </w:rPr>
-        <w:t>Methods summary · working draft · 19 September 2026</w:t>
+        <w:t>Methods summary · working draft · 20 September 2026</w:t>
       </w:r>
     </w:p>
     <w:p>
@@ -56,7 +56,7 @@
           <w:b w:val="0"/>
           <w:i w:val="0"/>
         </w:rPr>
-        <w:t>Multimodal large language models are increasingly used to score facial photographs on Likert scales, including for aesthetic and surgical outcome assessment. Published reports already quote figures of the form “GPT-4V rated our post-operative results 8.2/10.”</w:t>
+        <w:t>Multimodal large language models are increasingly used to score facial photographs on Likert scales by prompting alone — no model training, no calibration. Reports already quote figures of the form “the model rated our post-operative results 8.2/10.”</w:t>
       </w:r>
     </w:p>
     <w:p>
@@ -79,13 +79,51 @@
     </w:p>
     <w:p>
       <w:pPr>
+        <w:pStyle w:val="Heading2"/>
+      </w:pPr>
+      <w:r>
+        <w:rPr>
+          <w:color w:val="1F364D"/>
+        </w:rPr>
+        <w:t>2. Relationship to existing work in aesthetic surgery</w:t>
+      </w:r>
+    </w:p>
+    <w:p>
+      <w:r>
+        <w:rPr>
+          <w:b w:val="0"/>
+          <w:i w:val="0"/>
+        </w:rPr>
+        <w:t>AI-derived aesthetic scoring has already entered the surgical outcomes literature. Rames et al. applied trained ensemble models for perceived age and perceived attractiveness to 676 patients from the ASPS Before and After gallery, deriving a composite aesthetic benefit score and using it to compare procedures and identify patient factors associated with greater benefit (Plast Reconstr Surg, doi:10.1097/PRS.0000000000013412). That work establishes both the clinical appetite for objective aesthetic outcome measurement and the feasibility of applying computer vision at scale to surgical photographs.</w:t>
+      </w:r>
+    </w:p>
+    <w:p>
+      <w:r>
+        <w:rPr>
+          <w:b w:val="0"/>
+          <w:i w:val="0"/>
+        </w:rPr>
+        <w:t>Our scope is complementary. Rames et al. use purpose-trained supervised ensembles, fit to human ratings and validated against them. We examine general-purpose models prompted to produce ratings directly — the tool a clinician reaches for without training anything. These are different instruments with different failure modes: a supervised regressor is calibrated to its training distribution by construction, whereas a prompted model's output depends on how the question is worded.</w:t>
+      </w:r>
+    </w:p>
+    <w:p>
+      <w:r>
+        <w:rPr>
+          <w:b/>
+          <w:i w:val="0"/>
+        </w:rPr>
+        <w:t>This study asks what validation a prompted model requires before it is used the way trained models are now being used. Nothing here bears on the validity of purpose-trained models.</w:t>
+      </w:r>
+    </w:p>
+    <w:p>
+      <w:pPr>
         <w:pStyle w:val="Heading1"/>
       </w:pPr>
       <w:r>
         <w:rPr>
           <w:color w:val="1F364D"/>
         </w:rPr>
-        <w:t>2. Preliminary findings</w:t>
+        <w:t>3. Preliminary findings</w:t>
       </w:r>
     </w:p>
     <w:p>
@@ -94,7 +132,7 @@
           <w:b w:val="0"/>
           <w:i/>
         </w:rPr>
-        <w:t>All figures below are from a single open-weight model (Qwen2.5-VL-7B-Instruct) on the Chicago Face Database. They are pilot results and are not yet sufficient to support a claim about multimodal models as a class.</w:t>
+        <w:t>Two models so far — one open-weight (Qwen2.5-VL-7B) and one commercial (Claude Opus 5) — on the Chicago Face Database. They fail in opposite ways.</w:t>
       </w:r>
     </w:p>
     <w:tbl>
@@ -112,7 +150,7 @@
       <w:tr>
         <w:tc>
           <w:tcPr>
-            <w:tcW w:type="dxa" w:w="1944"/>
+            <w:tcW w:type="dxa" w:w="2448"/>
           </w:tcPr>
           <w:p>
             <w:r/>
@@ -127,7 +165,7 @@
         </w:tc>
         <w:tc>
           <w:tcPr>
-            <w:tcW w:type="dxa" w:w="1368"/>
+            <w:tcW w:type="dxa" w:w="3312"/>
           </w:tcPr>
           <w:p>
             <w:r/>
@@ -136,13 +174,13 @@
                 <w:b/>
                 <w:sz w:val="19"/>
               </w:rPr>
-              <w:t>Result</w:t>
+              <w:t>Qwen2.5-VL-7B</w:t>
             </w:r>
           </w:p>
         </w:tc>
         <w:tc>
           <w:tcPr>
-            <w:tcW w:type="dxa" w:w="5760"/>
+            <w:tcW w:type="dxa" w:w="3312"/>
           </w:tcPr>
           <w:p>
             <w:r/>
@@ -151,7 +189,7 @@
                 <w:b/>
                 <w:sz w:val="19"/>
               </w:rPr>
-              <w:t>Interpretation</w:t>
+              <w:t>Claude Opus 5</w:t>
             </w:r>
           </w:p>
         </w:tc>
@@ -159,7 +197,7 @@
       <w:tr>
         <w:tc>
           <w:tcPr>
-            <w:tcW w:type="dxa" w:w="1944"/>
+            <w:tcW w:type="dxa" w:w="2448"/>
           </w:tcPr>
           <w:p>
             <w:r/>
@@ -167,13 +205,13 @@
               <w:rPr>
                 <w:sz w:val="19"/>
               </w:rPr>
-              <w:t>Scale direction</w:t>
+              <w:t>Scale direction — flipping which end means “most attractive”, digits unchanged</w:t>
             </w:r>
           </w:p>
         </w:tc>
         <w:tc>
           <w:tcPr>
-            <w:tcW w:type="dxa" w:w="1368"/>
+            <w:tcW w:type="dxa" w:w="3312"/>
           </w:tcPr>
           <w:p>
             <w:r/>
@@ -181,13 +219,13 @@
               <w:rPr>
                 <w:sz w:val="19"/>
               </w:rPr>
-              <w:t>ρ = +0.982</w:t>
+              <w:t>ρ = +0.98 (should be strongly negative)</w:t>
             </w:r>
           </w:p>
         </w:tc>
         <w:tc>
           <w:tcPr>
-            <w:tcW w:type="dxa" w:w="5760"/>
+            <w:tcW w:type="dxa" w:w="3312"/>
           </w:tcPr>
           <w:p>
             <w:r/>
@@ -195,7 +233,7 @@
               <w:rPr>
                 <w:sz w:val="19"/>
               </w:rPr>
-              <w:t>Flipping which end means “most attractive”, with digits and their order unchanged, leaves ratings almost identical. A model reading the scale would give a strongly negative correlation.</w:t>
+              <w:t>pending</w:t>
             </w:r>
           </w:p>
         </w:tc>
@@ -203,7 +241,7 @@
       <w:tr>
         <w:tc>
           <w:tcPr>
-            <w:tcW w:type="dxa" w:w="1944"/>
+            <w:tcW w:type="dxa" w:w="2448"/>
           </w:tcPr>
           <w:p>
             <w:r/>
@@ -211,13 +249,13 @@
               <w:rPr>
                 <w:sz w:val="19"/>
               </w:rPr>
-              <w:t>Digit anchoring</w:t>
+              <w:t>Digit anchoring — reversing digit order, meaning unchanged</w:t>
             </w:r>
           </w:p>
         </w:tc>
         <w:tc>
           <w:tcPr>
-            <w:tcW w:type="dxa" w:w="1368"/>
+            <w:tcW w:type="dxa" w:w="3312"/>
           </w:tcPr>
           <w:p>
             <w:r/>
@@ -225,13 +263,13 @@
               <w:rPr>
                 <w:sz w:val="19"/>
               </w:rPr>
-              <w:t>2.1 points</w:t>
+              <w:t>mean shifts 2.2 points on a 7-point scale; ratings become uncorrelated with the photograph (ρ = 0.00)</w:t>
             </w:r>
           </w:p>
         </w:tc>
         <w:tc>
           <w:tcPr>
-            <w:tcW w:type="dxa" w:w="5760"/>
+            <w:tcW w:type="dxa" w:w="3312"/>
           </w:tcPr>
           <w:p>
             <w:r/>
@@ -239,7 +277,7 @@
               <w:rPr>
                 <w:sz w:val="19"/>
               </w:rPr>
-              <w:t>Reversing the digit order shifts the mean by 2.1 points on a 7-point scale, with the photographs unchanged.</w:t>
+              <w:t>pending</w:t>
             </w:r>
           </w:p>
         </w:tc>
@@ -247,7 +285,7 @@
       <w:tr>
         <w:tc>
           <w:tcPr>
-            <w:tcW w:type="dxa" w:w="1944"/>
+            <w:tcW w:type="dxa" w:w="2448"/>
           </w:tcPr>
           <w:p>
             <w:r/>
@@ -255,13 +293,13 @@
               <w:rPr>
                 <w:sz w:val="19"/>
               </w:rPr>
-              <w:t>Rating precision</w:t>
+              <w:t>Repeatability at a fixed prompt</w:t>
             </w:r>
           </w:p>
         </w:tc>
         <w:tc>
           <w:tcPr>
-            <w:tcW w:type="dxa" w:w="1368"/>
+            <w:tcW w:type="dxa" w:w="3312"/>
           </w:tcPr>
           <w:p>
             <w:r/>
@@ -269,13 +307,13 @@
               <w:rPr>
                 <w:sz w:val="19"/>
               </w:rPr>
-              <w:t>SE ≈ 0.44</w:t>
+              <w:t>SE ≈ 0.44 per image, larger than the true spread between faces (SD 0.27)</w:t>
             </w:r>
           </w:p>
         </w:tc>
         <w:tc>
           <w:tcPr>
-            <w:tcW w:type="dxa" w:w="5760"/>
+            <w:tcW w:type="dxa" w:w="3312"/>
           </w:tcPr>
           <w:p>
             <w:r/>
@@ -283,7 +321,7 @@
               <w:rPr>
                 <w:sz w:val="19"/>
               </w:rPr>
-              <w:t>Standard error of a single image’s rating exceeds the true spread between faces (SD 0.27). A clinician querying once per photograph cannot see this.</w:t>
+              <w:t>near-deterministic (SD 0.02)</w:t>
             </w:r>
           </w:p>
         </w:tc>
@@ -291,7 +329,7 @@
       <w:tr>
         <w:tc>
           <w:tcPr>
-            <w:tcW w:type="dxa" w:w="1944"/>
+            <w:tcW w:type="dxa" w:w="2448"/>
           </w:tcPr>
           <w:p>
             <w:r/>
@@ -299,13 +337,13 @@
               <w:rPr>
                 <w:sz w:val="19"/>
               </w:rPr>
-              <w:t>Presentation order</w:t>
+              <w:t>Scale use</w:t>
             </w:r>
           </w:p>
         </w:tc>
         <w:tc>
           <w:tcPr>
-            <w:tcW w:type="dxa" w:w="1368"/>
+            <w:tcW w:type="dxa" w:w="3312"/>
           </w:tcPr>
           <w:p>
             <w:r/>
@@ -313,13 +351,13 @@
               <w:rPr>
                 <w:sz w:val="19"/>
               </w:rPr>
-              <w:t>≈ 99%</w:t>
+              <w:t>uses the full range</w:t>
             </w:r>
           </w:p>
         </w:tc>
         <w:tc>
           <w:tcPr>
-            <w:tcW w:type="dxa" w:w="5760"/>
+            <w:tcW w:type="dxa" w:w="3312"/>
           </w:tcPr>
           <w:p>
             <w:r/>
@@ -327,7 +365,7 @@
               <w:rPr>
                 <w:sz w:val="19"/>
               </w:rPr>
-              <w:t>In paired comparison the model chose whichever image appeared second in almost every trial.</w:t>
+              <w:t>75% of all ratings are the midpoint; only 3 of 7 points ever used</w:t>
             </w:r>
           </w:p>
         </w:tc>
@@ -335,7 +373,7 @@
       <w:tr>
         <w:tc>
           <w:tcPr>
-            <w:tcW w:type="dxa" w:w="1944"/>
+            <w:tcW w:type="dxa" w:w="2448"/>
           </w:tcPr>
           <w:p>
             <w:r/>
@@ -343,13 +381,13 @@
               <w:rPr>
                 <w:sz w:val="19"/>
               </w:rPr>
-              <w:t>Counterbalancing</w:t>
+              <w:t>Presentation order in paired comparison</w:t>
             </w:r>
           </w:p>
         </w:tc>
         <w:tc>
           <w:tcPr>
-            <w:tcW w:type="dxa" w:w="1368"/>
+            <w:tcW w:type="dxa" w:w="3312"/>
           </w:tcPr>
           <w:p>
             <w:r/>
@@ -357,13 +395,13 @@
               <w:rPr>
                 <w:sz w:val="19"/>
               </w:rPr>
-              <w:t>53% → 81%</w:t>
+              <w:t>chooses the second image in ~99% of trials</w:t>
             </w:r>
           </w:p>
         </w:tc>
         <w:tc>
           <w:tcPr>
-            <w:tcW w:type="dxa" w:w="5760"/>
+            <w:tcW w:type="dxa" w:w="3312"/>
           </w:tcPr>
           <w:p>
             <w:r/>
@@ -371,7 +409,7 @@
               <w:rPr>
                 <w:sz w:val="19"/>
               </w:rPr>
-              <w:t>Accuracy against human ratings from a single presentation order is chance; averaging both orders recovers it.</w:t>
+              <w:t>position bias present; under measurement</w:t>
             </w:r>
           </w:p>
         </w:tc>
@@ -384,7 +422,7 @@
           <w:b/>
           <w:i w:val="0"/>
         </w:rPr>
-        <w:t>The second finding is the one most likely to affect practice, because it is invisible. A single API call returns a confident number with no indication that repeating it would return something different.</w:t>
+        <w:t>Qwen is imprecise and driven by the surface form of the question. Claude is perfectly repeatable but barely discriminates. Both are unusable as measurements, for opposite reasons — which is why validating the specific model and prompt in use is not optional.</w:t>
       </w:r>
     </w:p>
     <w:p>
@@ -395,94 +433,7 @@
         <w:rPr>
           <w:color w:val="1F364D"/>
         </w:rPr>
-        <w:t>3. Methods</w:t>
-      </w:r>
-    </w:p>
-    <w:p>
-      <w:pPr>
-        <w:pStyle w:val="Heading2"/>
-      </w:pPr>
-      <w:r>
-        <w:rPr>
-          <w:color w:val="1F364D"/>
-        </w:rPr>
-        <w:t>3.1 Stimuli</w:t>
-      </w:r>
-    </w:p>
-    <w:p>
-      <w:r>
-        <w:rPr>
-          <w:b w:val="0"/>
-          <w:i w:val="0"/>
-        </w:rPr>
-        <w:t>Chicago Face Database v3.0, neutral expression only: 831 photographs, 826 joined to norming records. CFD was chosen for standardized capture — identical lighting, camera, framing and expression across subjects. In uncontrolled datasets, photographic variance correlates with subject demographics, so any group difference in model output is confounded with how the groups were photographed.</w:t>
-      </w:r>
-    </w:p>
-    <w:p>
-      <w:r>
-        <w:rPr>
-          <w:b w:val="0"/>
-          <w:i w:val="0"/>
-        </w:rPr>
-        <w:t>CFD also supplies self-identified race, gender and age, human norming data, and 60 objective facial measurements. The measurements provide ground truth for the positive controls in §3.4.</w:t>
-      </w:r>
-    </w:p>
-    <w:p>
-      <w:r>
-        <w:rPr>
-          <w:b w:val="0"/>
-          <w:i w:val="0"/>
-        </w:rPr>
-        <w:t>Note on human norms: CFD’s principal attractiveness variable asks raters to judge each face relative to others of the same race and gender, so it is normed within group by construction and cannot serve as a between-group baseline. The India extension instead uses an absolute rating and is normed twice, by US and by Indian rater pools, on the same 141 faces. Those pools agree at ρ = 0.585 — the ceiling against which model–human agreement should be judged, rather than 1.0.</w:t>
-      </w:r>
-    </w:p>
-    <w:p>
-      <w:pPr>
-        <w:pStyle w:val="Heading2"/>
-      </w:pPr>
-      <w:r>
-        <w:rPr>
-          <w:color w:val="1F364D"/>
-        </w:rPr>
-        <w:t>3.2 Elicitation and readout</w:t>
-      </w:r>
-    </w:p>
-    <w:p>
-      <w:r>
-        <w:rPr>
-          <w:b w:val="0"/>
-          <w:i w:val="0"/>
-        </w:rPr>
-        <w:t>Models are prompted “On a scale of 1 to 7, how attractive is this person?” A 1–7 scale was chosen because every point is a single token under the tokenizers tested (“10” is two, which makes the readout ill-defined), and because it matches the scale of CFD’s human norms.</w:t>
-      </w:r>
-    </w:p>
-    <w:p>
-      <w:r>
-        <w:rPr>
-          <w:b w:val="0"/>
-          <w:i w:val="0"/>
-        </w:rPr>
-        <w:t>Where model weights are available, the rating is read exactly from the token probability distribution. Where they are not — as with some commercial APIs — the same quantity is estimated by sampling repeated responses and parsing them. Responses are classified as answer, hedged, refusal or unparseable; hedged responses contribute their rating, since counting them as refusals would both inflate the refusal rate and discard data. The two readouts are compared directly on models where both are possible, which is what licenses using the sampled one elsewhere.</w:t>
-      </w:r>
-    </w:p>
-    <w:p>
-      <w:pPr>
-        <w:pStyle w:val="Heading2"/>
-      </w:pPr>
-      <w:r>
-        <w:rPr>
-          <w:color w:val="1F364D"/>
-        </w:rPr>
-        <w:t>3.3 Validation battery</w:t>
-      </w:r>
-    </w:p>
-    <w:p>
-      <w:r>
-        <w:rPr>
-          <w:b w:val="0"/>
-          <w:i w:val="0"/>
-        </w:rPr>
-        <w:t>Four tests, each isolating one way the number could be produced by something other than the photograph:</w:t>
+        <w:t>4. Methods in brief</w:t>
       </w:r>
     </w:p>
     <w:p>
@@ -490,7 +441,7 @@
         <w:pStyle w:val="ListBullet"/>
       </w:pPr>
       <w:r>
-        <w:t>Scale semantics — two prompts with identical digits in identical order, differing only in which end is declared most attractive. This is the primary test.</w:t>
+        <w:t>Chicago Face Database, neutral expression, 831 photographs. Standardized lighting, camera and framing, so group differences cannot be confounded with how groups were photographed. Includes self-identified demographics, human norming data, and 60 objective facial measurements used as ground truth.</w:t>
       </w:r>
     </w:p>
     <w:p>
@@ -498,7 +449,7 @@
         <w:pStyle w:val="ListBullet"/>
       </w:pPr>
       <w:r>
-        <w:t>Digit anchoring — the digits are reordered with meaning otherwise unchanged, separating response to surface form from response to meaning.</w:t>
+        <w:t>Ratings read exactly from token probabilities where model weights allow, and estimated from repeated sampling where they do not. The two readouts are compared head-to-head on a model permitting both (ρ = 0.88), which is what licenses the sampled method on commercial APIs.</w:t>
       </w:r>
     </w:p>
     <w:p>
@@ -506,7 +457,7 @@
         <w:pStyle w:val="ListBullet"/>
       </w:pPr>
       <w:r>
-        <w:t>Paraphrase robustness — rewording without altering the scale. Rank agreement matters; a shift in level alone is survivable.</w:t>
+        <w:t>Four tests, each isolating one way the number could be produced by something other than the photograph: scale semantics, digit anchoring, paraphrase robustness, and refusal rate including refusal by demographic group.</w:t>
       </w:r>
     </w:p>
     <w:p>
@@ -514,65 +465,15 @@
         <w:pStyle w:val="ListBullet"/>
       </w:pPr>
       <w:r>
-        <w:t>Refusal — recorded per response rather than discarded, since differential refusal across demographic groups would itself be a finding.</w:t>
+        <w:t>Precision is decomposed into true between-face variation and sampling error, and correlations are reported both raw and corrected for attenuation.</w:t>
       </w:r>
     </w:p>
     <w:p>
       <w:pPr>
-        <w:pStyle w:val="Heading2"/>
+        <w:pStyle w:val="ListBullet"/>
       </w:pPr>
       <w:r>
-        <w:rPr>
-          <w:color w:val="1F364D"/>
-        </w:rPr>
-        <w:t>3.4 Precision</w:t>
-      </w:r>
-    </w:p>
-    <w:p>
-      <w:r>
-        <w:rPr>
-          <w:b w:val="0"/>
-          <w:i w:val="0"/>
-        </w:rPr>
-        <w:t>Each sampled rating is a noisy estimate, so observed variation between faces is the sum of true variation and sampling error. We decompose the two and report reliability, estimated both by that decomposition and by split-half correlation. Because low reliability drags every correlation toward zero, correlations are reported both raw and corrected — the corrected values as sensitivity analyses only, since at low reliability the correction is unstable.</w:t>
-      </w:r>
-    </w:p>
-    <w:p>
-      <w:r>
-        <w:rPr>
-          <w:b w:val="0"/>
-          <w:i w:val="0"/>
-        </w:rPr>
-        <w:t>Sampling temperature proved load-bearing: reliability rose from 0.27 to 0.95 when temperature fell from 1.0 to 0.3. It is reported explicitly and held constant.</w:t>
-      </w:r>
-    </w:p>
-    <w:p>
-      <w:pPr>
-        <w:pStyle w:val="Heading2"/>
-      </w:pPr>
-      <w:r>
-        <w:rPr>
-          <w:color w:val="1F364D"/>
-        </w:rPr>
-        <w:t>3.5 Pairwise comparison as an alternative</w:t>
-      </w:r>
-    </w:p>
-    <w:p>
-      <w:r>
-        <w:rPr>
-          <w:b w:val="0"/>
-          <w:i w:val="0"/>
-        </w:rPr>
-        <w:t>Where absolute rating fails, forced-choice comparison is the standard psychometric remedy for anchor-dependent scales. Every pair is presented in both orders, because the model shows a near-deterministic preference for whichever image appears second. Averaging must be performed in log-odds rather than probability: the bias is additive on that scale, and averaging probabilities collapses the comparison toward a coin flip.</w:t>
-      </w:r>
-    </w:p>
-    <w:p>
-      <w:r>
-        <w:rPr>
-          <w:b w:val="0"/>
-          <w:i w:val="0"/>
-        </w:rPr>
-        <w:t>Comparison ability is verified separately using questions with objective answers drawn from CFD’s measurements — for example which face has the wider nose — which distinguishes inability to compare images from absence of a stable preference. Comparisons are then converted to a latent scale by Bradley–Terry.</w:t>
+        <w:t>Where absolute rating fails, counterbalanced forced-choice comparison is evaluated as the alternative — the standard psychometric remedy for anchor-dependent scales, and structurally the same judgement the Global Aesthetic Improvement Scale asks for.</w:t>
       </w:r>
     </w:p>
     <w:p>
@@ -583,7 +484,7 @@
         <w:rPr>
           <w:color w:val="1F364D"/>
         </w:rPr>
-        <w:t>4. What remains before submission</w:t>
+        <w:t>5. What remains</w:t>
       </w:r>
     </w:p>
     <w:p>
@@ -591,7 +492,7 @@
         <w:pStyle w:val="ListBullet"/>
       </w:pPr>
       <w:r>
-        <w:t>Additional models. All figures above come from one 7B open-weight model. At minimum two further open-weight models, plus the commercial models clinicians actually use.</w:t>
+        <w:t>Additional models, including further commercial systems, before any claim about multimodal models as a class.</w:t>
       </w:r>
     </w:p>
     <w:p>
@@ -599,7 +500,7 @@
         <w:pStyle w:val="ListBullet"/>
       </w:pPr>
       <w:r>
-        <w:t>Model scale. Whether these failures persist in frontier-scale models is the first question a reviewer will ask.</w:t>
+        <w:t>Whether these failures persist at frontier scale — the first question a reviewer will ask.</w:t>
       </w:r>
     </w:p>
     <w:p>
@@ -607,15 +508,7 @@
         <w:pStyle w:val="ListBullet"/>
       </w:pPr>
       <w:r>
-        <w:t>Temperature sensitivity. The battery should be reported at a second temperature to show the finding is not an artifact of the chosen value.</w:t>
-      </w:r>
-    </w:p>
-    <w:p>
-      <w:pPr>
-        <w:pStyle w:val="ListBullet"/>
-      </w:pPr>
-      <w:r>
-        <w:t>Two pilot comparisons changed two variables at once and must be re-run before being cited.</w:t>
+        <w:t>A scale-format arm: verbally anchored and categorical scales, to test whether the formats used by validated clinical instruments avoid the failures seen with bare numeric scales.</w:t>
       </w:r>
     </w:p>
     <w:p>
@@ -626,7 +519,7 @@
         <w:rPr>
           <w:color w:val="1F364D"/>
         </w:rPr>
-        <w:t>5. Positioning</w:t>
+        <w:t>6. Positioning</w:t>
       </w:r>
     </w:p>
     <w:p>
@@ -644,7 +537,7 @@
           <w:b w:val="0"/>
           <w:i w:val="0"/>
         </w:rPr>
-        <w:t>Candidate venues: Aesthetic Surgery Journal; Facial Plastic Surgery &amp; Aesthetic Medicine; Plastic and Reconstructive Surgery – Global Open. No patient data, no IRB requirement; all stimuli from a public de-identified research database. Code and analysis are public at github.com/shiitavie/face.</w:t>
+        <w:t>Candidate venues: Aesthetic Surgery Journal; Facial Plastic Surgery &amp; Aesthetic Medicine; Plastic and Reconstructive Surgery – Global Open. No patient data and no IRB requirement; all stimuli are from a public de-identified research database. Code and analysis are public at github.com/shiitavie/face.</w:t>
       </w:r>
     </w:p>
     <w:sectPr>

</xml_diff>